<commit_message>
19 Aug our commit -v2
</commit_message>
<xml_diff>
--- a/Tujitunze_User_Roles_and_System_Interactions.docx
+++ b/Tujitunze_User_Roles_and_System_Interactions.docx
@@ -159,6 +159,7 @@
             <w:pPr>
               <w:pStyle w:val="Normal"/>
               <w:widowControl/>
+              <w:suppressAutoHyphens w:val="true"/>
               <w:spacing w:lineRule="auto" w:line="240" w:before="0" w:after="0"/>
               <w:jc w:val="start"/>
               <w:rPr>
@@ -198,6 +199,7 @@
             <w:pPr>
               <w:pStyle w:val="Normal"/>
               <w:widowControl/>
+              <w:suppressAutoHyphens w:val="true"/>
               <w:spacing w:lineRule="auto" w:line="240" w:before="0" w:after="0"/>
               <w:jc w:val="start"/>
               <w:rPr>
@@ -237,6 +239,7 @@
             <w:pPr>
               <w:pStyle w:val="Normal"/>
               <w:widowControl/>
+              <w:suppressAutoHyphens w:val="true"/>
               <w:spacing w:lineRule="auto" w:line="240" w:before="0" w:after="0"/>
               <w:jc w:val="start"/>
               <w:rPr>
@@ -277,6 +280,7 @@
             <w:pPr>
               <w:pStyle w:val="Normal"/>
               <w:widowControl/>
+              <w:suppressAutoHyphens w:val="true"/>
               <w:spacing w:lineRule="auto" w:line="240" w:before="0" w:after="0"/>
               <w:jc w:val="start"/>
               <w:rPr>
@@ -313,6 +317,7 @@
             <w:pPr>
               <w:pStyle w:val="Normal"/>
               <w:widowControl/>
+              <w:suppressAutoHyphens w:val="true"/>
               <w:spacing w:lineRule="auto" w:line="240" w:before="0" w:after="0"/>
               <w:jc w:val="start"/>
               <w:rPr>
@@ -345,6 +350,7 @@
             <w:pPr>
               <w:pStyle w:val="Normal"/>
               <w:widowControl/>
+              <w:suppressAutoHyphens w:val="true"/>
               <w:spacing w:lineRule="auto" w:line="240" w:before="0" w:after="0"/>
               <w:jc w:val="start"/>
               <w:rPr>
@@ -379,6 +385,7 @@
             <w:pPr>
               <w:pStyle w:val="Normal"/>
               <w:widowControl/>
+              <w:suppressAutoHyphens w:val="true"/>
               <w:spacing w:lineRule="auto" w:line="240" w:before="0" w:after="0"/>
               <w:jc w:val="start"/>
               <w:rPr>
@@ -414,6 +421,7 @@
             <w:pPr>
               <w:pStyle w:val="Normal"/>
               <w:widowControl/>
+              <w:suppressAutoHyphens w:val="true"/>
               <w:spacing w:lineRule="auto" w:line="240" w:before="0" w:after="0"/>
               <w:jc w:val="start"/>
               <w:rPr>
@@ -445,6 +453,7 @@
             <w:pPr>
               <w:pStyle w:val="Normal"/>
               <w:widowControl/>
+              <w:suppressAutoHyphens w:val="true"/>
               <w:spacing w:lineRule="auto" w:line="240" w:before="0" w:after="0"/>
               <w:jc w:val="start"/>
               <w:rPr>
@@ -480,6 +489,7 @@
             <w:pPr>
               <w:pStyle w:val="Normal"/>
               <w:widowControl/>
+              <w:suppressAutoHyphens w:val="true"/>
               <w:spacing w:lineRule="auto" w:line="240" w:before="0" w:after="0"/>
               <w:jc w:val="start"/>
               <w:rPr>
@@ -516,6 +526,7 @@
             <w:pPr>
               <w:pStyle w:val="Normal"/>
               <w:widowControl/>
+              <w:suppressAutoHyphens w:val="true"/>
               <w:spacing w:lineRule="auto" w:line="240" w:before="0" w:after="0"/>
               <w:jc w:val="start"/>
               <w:rPr>
@@ -548,6 +559,7 @@
             <w:pPr>
               <w:pStyle w:val="Normal"/>
               <w:widowControl/>
+              <w:suppressAutoHyphens w:val="true"/>
               <w:spacing w:lineRule="auto" w:line="240" w:before="0" w:after="0"/>
               <w:jc w:val="start"/>
               <w:rPr>
@@ -582,6 +594,7 @@
             <w:pPr>
               <w:pStyle w:val="Normal"/>
               <w:widowControl/>
+              <w:suppressAutoHyphens w:val="true"/>
               <w:spacing w:lineRule="auto" w:line="240" w:before="0" w:after="0"/>
               <w:jc w:val="start"/>
               <w:rPr>
@@ -617,6 +630,7 @@
             <w:pPr>
               <w:pStyle w:val="Normal"/>
               <w:widowControl/>
+              <w:suppressAutoHyphens w:val="true"/>
               <w:spacing w:lineRule="auto" w:line="240" w:before="0" w:after="0"/>
               <w:jc w:val="start"/>
               <w:rPr>
@@ -648,6 +662,7 @@
             <w:pPr>
               <w:pStyle w:val="Normal"/>
               <w:widowControl/>
+              <w:suppressAutoHyphens w:val="true"/>
               <w:spacing w:lineRule="auto" w:line="240" w:before="0" w:after="0"/>
               <w:jc w:val="start"/>
               <w:rPr>
@@ -683,6 +698,7 @@
             <w:pPr>
               <w:pStyle w:val="Normal"/>
               <w:widowControl/>
+              <w:suppressAutoHyphens w:val="true"/>
               <w:spacing w:lineRule="auto" w:line="240" w:before="0" w:after="0"/>
               <w:jc w:val="start"/>
               <w:rPr>
@@ -719,6 +735,7 @@
             <w:pPr>
               <w:pStyle w:val="Normal"/>
               <w:widowControl/>
+              <w:suppressAutoHyphens w:val="true"/>
               <w:spacing w:lineRule="auto" w:line="240" w:before="0" w:after="0"/>
               <w:jc w:val="start"/>
               <w:rPr>
@@ -751,6 +768,7 @@
             <w:pPr>
               <w:pStyle w:val="Normal"/>
               <w:widowControl/>
+              <w:suppressAutoHyphens w:val="true"/>
               <w:spacing w:lineRule="auto" w:line="240" w:before="0" w:after="0"/>
               <w:jc w:val="start"/>
               <w:rPr>
@@ -785,6 +803,7 @@
             <w:pPr>
               <w:pStyle w:val="Normal"/>
               <w:widowControl/>
+              <w:suppressAutoHyphens w:val="true"/>
               <w:spacing w:lineRule="auto" w:line="240" w:before="0" w:after="0"/>
               <w:jc w:val="start"/>
               <w:rPr>
@@ -820,6 +839,7 @@
             <w:pPr>
               <w:pStyle w:val="Normal"/>
               <w:widowControl/>
+              <w:suppressAutoHyphens w:val="true"/>
               <w:spacing w:lineRule="auto" w:line="240" w:before="0" w:after="0"/>
               <w:jc w:val="start"/>
               <w:rPr>
@@ -851,6 +871,7 @@
             <w:pPr>
               <w:pStyle w:val="Normal"/>
               <w:widowControl/>
+              <w:suppressAutoHyphens w:val="true"/>
               <w:spacing w:lineRule="auto" w:line="240" w:before="0" w:after="0"/>
               <w:jc w:val="start"/>
               <w:rPr>
@@ -886,6 +907,7 @@
             <w:pPr>
               <w:pStyle w:val="Normal"/>
               <w:widowControl/>
+              <w:suppressAutoHyphens w:val="true"/>
               <w:spacing w:lineRule="auto" w:line="240" w:before="0" w:after="0"/>
               <w:jc w:val="start"/>
               <w:rPr>
@@ -922,6 +944,7 @@
             <w:pPr>
               <w:pStyle w:val="Normal"/>
               <w:widowControl/>
+              <w:suppressAutoHyphens w:val="true"/>
               <w:spacing w:lineRule="auto" w:line="240" w:before="0" w:after="0"/>
               <w:jc w:val="start"/>
               <w:rPr>
@@ -954,6 +977,7 @@
             <w:pPr>
               <w:pStyle w:val="Normal"/>
               <w:widowControl/>
+              <w:suppressAutoHyphens w:val="true"/>
               <w:spacing w:lineRule="auto" w:line="240" w:before="0" w:after="0"/>
               <w:jc w:val="start"/>
               <w:rPr>
@@ -2540,17 +2564,25 @@
     </w:p>
     <w:p>
       <w:pPr>
-        <w:pStyle w:val="Normal"/>
-        <w:rPr>
-          <w:sz w:val="30"/>
-          <w:szCs w:val="30"/>
-        </w:rPr>
+        <w:pStyle w:val="BodyText"/>
+        <w:rPr/>
       </w:pPr>
       <w:r>
-        <w:rPr>
-          <w:sz w:val="30"/>
-          <w:szCs w:val="30"/>
-        </w:rPr>
+        <w:rPr/>
+        <w:t xml:space="preserve">• </w:t>
+      </w:r>
+      <w:r>
+        <w:rPr/>
+        <w:t>Added files: • backend/src/modules/contributions/{contributions.service.ts,contributions.controller.ts,dto/apply-contribution.dto.ts} • backend/src/modules/audit/{audit.entity.ts,audit.service.ts} and updated audit.module.ts • small updates to contributions.module.ts, wallets.module.ts, contribution-rule.entity.ts • Behavior: • POST /contributions/apply accepts ApplyContributionDto and performs an idempotent, transactional contribution application: • picks active contribution rule • computes contribution amount (FIXED or PERCENTAGE, applies max) • creates contribution_transactions row • creates or finds health_wallet row, creates wallet_transactions row, updates wallet balance • writes audit_logs entry inside same DB transaction • Next recommended steps: • Add TypeORM entities to AppModule entity paths (already configured with glob pattern). • Seed at least one contribution_rule for testing (INSERT into contribution_rules). • Run the backend and hit POST /contributions/apply with a JSON body to test.</w:t>
+      </w:r>
+    </w:p>
+    <w:p>
+      <w:pPr>
+        <w:pStyle w:val="BodyText"/>
+        <w:rPr/>
+      </w:pPr>
+      <w:r>
+        <w:rPr/>
       </w:r>
       <w:r>
         <w:br w:type="page"/>
@@ -2632,6 +2664,7 @@
         </w:tabs>
         <w:ind w:start="1080" w:hanging="360"/>
       </w:pPr>
+      <w:rPr/>
     </w:lvl>
     <w:lvl w:ilvl="2">
       <w:start w:val="1"/>
@@ -2644,6 +2677,7 @@
         </w:tabs>
         <w:ind w:start="1440" w:hanging="360"/>
       </w:pPr>
+      <w:rPr/>
     </w:lvl>
     <w:lvl w:ilvl="3">
       <w:start w:val="1"/>
@@ -2656,6 +2690,7 @@
         </w:tabs>
         <w:ind w:start="1800" w:hanging="360"/>
       </w:pPr>
+      <w:rPr/>
     </w:lvl>
     <w:lvl w:ilvl="4">
       <w:start w:val="1"/>
@@ -2668,6 +2703,7 @@
         </w:tabs>
         <w:ind w:start="2160" w:hanging="360"/>
       </w:pPr>
+      <w:rPr/>
     </w:lvl>
     <w:lvl w:ilvl="5">
       <w:start w:val="1"/>
@@ -2680,6 +2716,7 @@
         </w:tabs>
         <w:ind w:start="2520" w:hanging="360"/>
       </w:pPr>
+      <w:rPr/>
     </w:lvl>
     <w:lvl w:ilvl="6">
       <w:start w:val="1"/>
@@ -2692,6 +2729,7 @@
         </w:tabs>
         <w:ind w:start="2880" w:hanging="360"/>
       </w:pPr>
+      <w:rPr/>
     </w:lvl>
     <w:lvl w:ilvl="7">
       <w:start w:val="1"/>
@@ -2704,6 +2742,7 @@
         </w:tabs>
         <w:ind w:start="3240" w:hanging="360"/>
       </w:pPr>
+      <w:rPr/>
     </w:lvl>
     <w:lvl w:ilvl="8">
       <w:start w:val="1"/>
@@ -2716,6 +2755,7 @@
         </w:tabs>
         <w:ind w:start="3600" w:hanging="360"/>
       </w:pPr>
+      <w:rPr/>
     </w:lvl>
   </w:abstractNum>
   <w:abstractNum w:abstractNumId="2">
@@ -2745,6 +2785,7 @@
         </w:tabs>
         <w:ind w:start="1080" w:hanging="360"/>
       </w:pPr>
+      <w:rPr/>
     </w:lvl>
     <w:lvl w:ilvl="2">
       <w:start w:val="1"/>
@@ -2757,6 +2798,7 @@
         </w:tabs>
         <w:ind w:start="1440" w:hanging="360"/>
       </w:pPr>
+      <w:rPr/>
     </w:lvl>
     <w:lvl w:ilvl="3">
       <w:start w:val="1"/>
@@ -2769,6 +2811,7 @@
         </w:tabs>
         <w:ind w:start="1800" w:hanging="360"/>
       </w:pPr>
+      <w:rPr/>
     </w:lvl>
     <w:lvl w:ilvl="4">
       <w:start w:val="1"/>
@@ -2781,6 +2824,7 @@
         </w:tabs>
         <w:ind w:start="2160" w:hanging="360"/>
       </w:pPr>
+      <w:rPr/>
     </w:lvl>
     <w:lvl w:ilvl="5">
       <w:start w:val="1"/>
@@ -2793,6 +2837,7 @@
         </w:tabs>
         <w:ind w:start="2520" w:hanging="360"/>
       </w:pPr>
+      <w:rPr/>
     </w:lvl>
     <w:lvl w:ilvl="6">
       <w:start w:val="1"/>
@@ -2805,6 +2850,7 @@
         </w:tabs>
         <w:ind w:start="2880" w:hanging="360"/>
       </w:pPr>
+      <w:rPr/>
     </w:lvl>
     <w:lvl w:ilvl="7">
       <w:start w:val="1"/>
@@ -2817,6 +2863,7 @@
         </w:tabs>
         <w:ind w:start="3240" w:hanging="360"/>
       </w:pPr>
+      <w:rPr/>
     </w:lvl>
     <w:lvl w:ilvl="8">
       <w:start w:val="1"/>
@@ -2829,6 +2876,7 @@
         </w:tabs>
         <w:ind w:start="3600" w:hanging="360"/>
       </w:pPr>
+      <w:rPr/>
     </w:lvl>
   </w:abstractNum>
   <w:abstractNum w:abstractNumId="3">
@@ -2858,6 +2906,7 @@
         </w:tabs>
         <w:ind w:start="1080" w:hanging="360"/>
       </w:pPr>
+      <w:rPr/>
     </w:lvl>
     <w:lvl w:ilvl="2">
       <w:start w:val="1"/>
@@ -2870,6 +2919,7 @@
         </w:tabs>
         <w:ind w:start="1440" w:hanging="360"/>
       </w:pPr>
+      <w:rPr/>
     </w:lvl>
     <w:lvl w:ilvl="3">
       <w:start w:val="1"/>
@@ -2882,6 +2932,7 @@
         </w:tabs>
         <w:ind w:start="1800" w:hanging="360"/>
       </w:pPr>
+      <w:rPr/>
     </w:lvl>
     <w:lvl w:ilvl="4">
       <w:start w:val="1"/>
@@ -2894,6 +2945,7 @@
         </w:tabs>
         <w:ind w:start="2160" w:hanging="360"/>
       </w:pPr>
+      <w:rPr/>
     </w:lvl>
     <w:lvl w:ilvl="5">
       <w:start w:val="1"/>
@@ -2906,6 +2958,7 @@
         </w:tabs>
         <w:ind w:start="2520" w:hanging="360"/>
       </w:pPr>
+      <w:rPr/>
     </w:lvl>
     <w:lvl w:ilvl="6">
       <w:start w:val="1"/>
@@ -2918,6 +2971,7 @@
         </w:tabs>
         <w:ind w:start="2880" w:hanging="360"/>
       </w:pPr>
+      <w:rPr/>
     </w:lvl>
     <w:lvl w:ilvl="7">
       <w:start w:val="1"/>
@@ -2930,6 +2984,7 @@
         </w:tabs>
         <w:ind w:start="3240" w:hanging="360"/>
       </w:pPr>
+      <w:rPr/>
     </w:lvl>
     <w:lvl w:ilvl="8">
       <w:start w:val="1"/>
@@ -2942,6 +2997,7 @@
         </w:tabs>
         <w:ind w:start="3600" w:hanging="360"/>
       </w:pPr>
+      <w:rPr/>
     </w:lvl>
   </w:abstractNum>
   <w:abstractNum w:abstractNumId="4">
@@ -2969,6 +3025,7 @@
         </w:tabs>
         <w:ind w:start="1080" w:hanging="360"/>
       </w:pPr>
+      <w:rPr/>
     </w:lvl>
     <w:lvl w:ilvl="2">
       <w:start w:val="1"/>
@@ -2981,6 +3038,7 @@
         </w:tabs>
         <w:ind w:start="1440" w:hanging="360"/>
       </w:pPr>
+      <w:rPr/>
     </w:lvl>
     <w:lvl w:ilvl="3">
       <w:start w:val="1"/>
@@ -2993,6 +3051,7 @@
         </w:tabs>
         <w:ind w:start="1800" w:hanging="360"/>
       </w:pPr>
+      <w:rPr/>
     </w:lvl>
     <w:lvl w:ilvl="4">
       <w:start w:val="1"/>
@@ -3005,6 +3064,7 @@
         </w:tabs>
         <w:ind w:start="2160" w:hanging="360"/>
       </w:pPr>
+      <w:rPr/>
     </w:lvl>
     <w:lvl w:ilvl="5">
       <w:start w:val="1"/>
@@ -3017,6 +3077,7 @@
         </w:tabs>
         <w:ind w:start="2520" w:hanging="360"/>
       </w:pPr>
+      <w:rPr/>
     </w:lvl>
     <w:lvl w:ilvl="6">
       <w:start w:val="1"/>
@@ -3029,6 +3090,7 @@
         </w:tabs>
         <w:ind w:start="2880" w:hanging="360"/>
       </w:pPr>
+      <w:rPr/>
     </w:lvl>
     <w:lvl w:ilvl="7">
       <w:start w:val="1"/>
@@ -3041,6 +3103,7 @@
         </w:tabs>
         <w:ind w:start="3240" w:hanging="360"/>
       </w:pPr>
+      <w:rPr/>
     </w:lvl>
     <w:lvl w:ilvl="8">
       <w:start w:val="1"/>
@@ -3053,6 +3116,7 @@
         </w:tabs>
         <w:ind w:start="3600" w:hanging="360"/>
       </w:pPr>
+      <w:rPr/>
     </w:lvl>
   </w:abstractNum>
   <w:abstractNum w:abstractNumId="5">
@@ -3080,6 +3144,7 @@
         </w:tabs>
         <w:ind w:start="1080" w:hanging="360"/>
       </w:pPr>
+      <w:rPr/>
     </w:lvl>
     <w:lvl w:ilvl="2">
       <w:start w:val="1"/>
@@ -3092,6 +3157,7 @@
         </w:tabs>
         <w:ind w:start="1440" w:hanging="360"/>
       </w:pPr>
+      <w:rPr/>
     </w:lvl>
     <w:lvl w:ilvl="3">
       <w:start w:val="1"/>
@@ -3104,6 +3170,7 @@
         </w:tabs>
         <w:ind w:start="1800" w:hanging="360"/>
       </w:pPr>
+      <w:rPr/>
     </w:lvl>
     <w:lvl w:ilvl="4">
       <w:start w:val="1"/>
@@ -3116,6 +3183,7 @@
         </w:tabs>
         <w:ind w:start="2160" w:hanging="360"/>
       </w:pPr>
+      <w:rPr/>
     </w:lvl>
     <w:lvl w:ilvl="5">
       <w:start w:val="1"/>
@@ -3128,6 +3196,7 @@
         </w:tabs>
         <w:ind w:start="2520" w:hanging="360"/>
       </w:pPr>
+      <w:rPr/>
     </w:lvl>
     <w:lvl w:ilvl="6">
       <w:start w:val="1"/>
@@ -3140,6 +3209,7 @@
         </w:tabs>
         <w:ind w:start="2880" w:hanging="360"/>
       </w:pPr>
+      <w:rPr/>
     </w:lvl>
     <w:lvl w:ilvl="7">
       <w:start w:val="1"/>
@@ -3152,6 +3222,7 @@
         </w:tabs>
         <w:ind w:start="3240" w:hanging="360"/>
       </w:pPr>
+      <w:rPr/>
     </w:lvl>
     <w:lvl w:ilvl="8">
       <w:start w:val="1"/>
@@ -3164,6 +3235,7 @@
         </w:tabs>
         <w:ind w:start="3600" w:hanging="360"/>
       </w:pPr>
+      <w:rPr/>
     </w:lvl>
   </w:abstractNum>
   <w:abstractNum w:abstractNumId="6">
@@ -3191,6 +3263,7 @@
         </w:tabs>
         <w:ind w:start="1080" w:hanging="360"/>
       </w:pPr>
+      <w:rPr/>
     </w:lvl>
     <w:lvl w:ilvl="2">
       <w:start w:val="1"/>
@@ -3203,6 +3276,7 @@
         </w:tabs>
         <w:ind w:start="1440" w:hanging="360"/>
       </w:pPr>
+      <w:rPr/>
     </w:lvl>
     <w:lvl w:ilvl="3">
       <w:start w:val="1"/>
@@ -3215,6 +3289,7 @@
         </w:tabs>
         <w:ind w:start="1800" w:hanging="360"/>
       </w:pPr>
+      <w:rPr/>
     </w:lvl>
     <w:lvl w:ilvl="4">
       <w:start w:val="1"/>
@@ -3227,6 +3302,7 @@
         </w:tabs>
         <w:ind w:start="2160" w:hanging="360"/>
       </w:pPr>
+      <w:rPr/>
     </w:lvl>
     <w:lvl w:ilvl="5">
       <w:start w:val="1"/>
@@ -3239,6 +3315,7 @@
         </w:tabs>
         <w:ind w:start="2520" w:hanging="360"/>
       </w:pPr>
+      <w:rPr/>
     </w:lvl>
     <w:lvl w:ilvl="6">
       <w:start w:val="1"/>
@@ -3251,6 +3328,7 @@
         </w:tabs>
         <w:ind w:start="2880" w:hanging="360"/>
       </w:pPr>
+      <w:rPr/>
     </w:lvl>
     <w:lvl w:ilvl="7">
       <w:start w:val="1"/>
@@ -3263,6 +3341,7 @@
         </w:tabs>
         <w:ind w:start="3240" w:hanging="360"/>
       </w:pPr>
+      <w:rPr/>
     </w:lvl>
     <w:lvl w:ilvl="8">
       <w:start w:val="1"/>
@@ -3275,6 +3354,7 @@
         </w:tabs>
         <w:ind w:start="3600" w:hanging="360"/>
       </w:pPr>
+      <w:rPr/>
     </w:lvl>
   </w:abstractNum>
   <w:abstractNum w:abstractNumId="7">
@@ -3425,7 +3505,7 @@
   <w:docDefaults>
     <w:rPrDefault>
       <w:rPr>
-        <w:rFonts w:ascii="Cambria" w:hAnsi="Cambria" w:eastAsia="ＭＳ 明朝" w:cs="" w:asciiTheme="minorHAnsi" w:cstheme="minorBidi" w:eastAsiaTheme="minorEastAsia" w:hAnsiTheme="minorHAnsi"/>
+        <w:rFonts w:ascii="Cambria" w:hAnsi="Cambria" w:eastAsia="" w:cs="" w:asciiTheme="minorHAnsi" w:cstheme="minorBidi" w:eastAsiaTheme="minorEastAsia" w:hAnsiTheme="minorHAnsi"/>
         <w:sz w:val="22"/>
         <w:szCs w:val="22"/>
         <w:lang w:val="en-US" w:eastAsia="en-US" w:bidi="ar-SA"/>
@@ -3582,12 +3662,13 @@
     <w:rsid w:val="00fc693f"/>
     <w:pPr>
       <w:widowControl/>
+      <w:suppressAutoHyphens w:val="true"/>
       <w:bidi w:val="0"/>
       <w:spacing w:lineRule="auto" w:line="276" w:before="0" w:after="200"/>
       <w:jc w:val="start"/>
     </w:pPr>
     <w:rPr>
-      <w:rFonts w:ascii="Calibri" w:hAnsi="Calibri" w:eastAsia="ＭＳ 明朝" w:cs="" w:cstheme="minorBidi" w:eastAsiaTheme="minorEastAsia"/>
+      <w:rFonts w:ascii="Calibri" w:hAnsi="Calibri" w:eastAsia="" w:cs="" w:cstheme="minorBidi" w:eastAsiaTheme="minorEastAsia"/>
       <w:color w:val="auto"/>
       <w:kern w:val="0"/>
       <w:sz w:val="22"/>
@@ -3610,7 +3691,7 @@
       <w:outlineLvl w:val="0"/>
     </w:pPr>
     <w:rPr>
-      <w:rFonts w:ascii="Calibri" w:hAnsi="Calibri" w:eastAsia="ＭＳ ゴシック" w:cs="" w:asciiTheme="majorHAnsi" w:cstheme="majorBidi" w:eastAsiaTheme="majorEastAsia" w:hAnsiTheme="majorHAnsi"/>
+      <w:rFonts w:ascii="Calibri" w:hAnsi="Calibri" w:eastAsia="" w:cs="" w:asciiTheme="majorHAnsi" w:cstheme="majorBidi" w:eastAsiaTheme="majorEastAsia" w:hAnsiTheme="majorHAnsi"/>
       <w:b/>
       <w:bCs/>
       <w:color w:themeColor="accent1" w:themeShade="bf" w:val="365F91"/>
@@ -3634,7 +3715,7 @@
       <w:outlineLvl w:val="1"/>
     </w:pPr>
     <w:rPr>
-      <w:rFonts w:ascii="Calibri" w:hAnsi="Calibri" w:eastAsia="ＭＳ ゴシック" w:cs="" w:asciiTheme="majorHAnsi" w:cstheme="majorBidi" w:eastAsiaTheme="majorEastAsia" w:hAnsiTheme="majorHAnsi"/>
+      <w:rFonts w:ascii="Calibri" w:hAnsi="Calibri" w:eastAsia="" w:cs="" w:asciiTheme="majorHAnsi" w:cstheme="majorBidi" w:eastAsiaTheme="majorEastAsia" w:hAnsiTheme="majorHAnsi"/>
       <w:b/>
       <w:bCs/>
       <w:color w:themeColor="accent1" w:val="4F81BD"/>
@@ -3658,7 +3739,7 @@
       <w:outlineLvl w:val="2"/>
     </w:pPr>
     <w:rPr>
-      <w:rFonts w:ascii="Calibri" w:hAnsi="Calibri" w:eastAsia="ＭＳ ゴシック" w:cs="" w:asciiTheme="majorHAnsi" w:cstheme="majorBidi" w:eastAsiaTheme="majorEastAsia" w:hAnsiTheme="majorHAnsi"/>
+      <w:rFonts w:ascii="Calibri" w:hAnsi="Calibri" w:eastAsia="" w:cs="" w:asciiTheme="majorHAnsi" w:cstheme="majorBidi" w:eastAsiaTheme="majorEastAsia" w:hAnsiTheme="majorHAnsi"/>
       <w:b/>
       <w:bCs/>
       <w:color w:themeColor="accent1" w:val="4F81BD"/>
@@ -3681,7 +3762,7 @@
       <w:outlineLvl w:val="3"/>
     </w:pPr>
     <w:rPr>
-      <w:rFonts w:ascii="Calibri" w:hAnsi="Calibri" w:eastAsia="ＭＳ ゴシック" w:cs="" w:asciiTheme="majorHAnsi" w:cstheme="majorBidi" w:eastAsiaTheme="majorEastAsia" w:hAnsiTheme="majorHAnsi"/>
+      <w:rFonts w:ascii="Calibri" w:hAnsi="Calibri" w:eastAsia="" w:cs="" w:asciiTheme="majorHAnsi" w:cstheme="majorBidi" w:eastAsiaTheme="majorEastAsia" w:hAnsiTheme="majorHAnsi"/>
       <w:b/>
       <w:bCs/>
       <w:i/>
@@ -3706,7 +3787,7 @@
       <w:outlineLvl w:val="4"/>
     </w:pPr>
     <w:rPr>
-      <w:rFonts w:ascii="Calibri" w:hAnsi="Calibri" w:eastAsia="ＭＳ ゴシック" w:cs="" w:asciiTheme="majorHAnsi" w:cstheme="majorBidi" w:eastAsiaTheme="majorEastAsia" w:hAnsiTheme="majorHAnsi"/>
+      <w:rFonts w:ascii="Calibri" w:hAnsi="Calibri" w:eastAsia="" w:cs="" w:asciiTheme="majorHAnsi" w:cstheme="majorBidi" w:eastAsiaTheme="majorEastAsia" w:hAnsiTheme="majorHAnsi"/>
       <w:color w:themeColor="accent1" w:themeShade="7f" w:val="243F60"/>
     </w:rPr>
   </w:style>
@@ -3727,7 +3808,7 @@
       <w:outlineLvl w:val="5"/>
     </w:pPr>
     <w:rPr>
-      <w:rFonts w:ascii="Calibri" w:hAnsi="Calibri" w:eastAsia="ＭＳ ゴシック" w:cs="" w:asciiTheme="majorHAnsi" w:cstheme="majorBidi" w:eastAsiaTheme="majorEastAsia" w:hAnsiTheme="majorHAnsi"/>
+      <w:rFonts w:ascii="Calibri" w:hAnsi="Calibri" w:eastAsia="" w:cs="" w:asciiTheme="majorHAnsi" w:cstheme="majorBidi" w:eastAsiaTheme="majorEastAsia" w:hAnsiTheme="majorHAnsi"/>
       <w:i/>
       <w:iCs/>
       <w:color w:themeColor="accent1" w:themeShade="7f" w:val="243F60"/>
@@ -3750,7 +3831,7 @@
       <w:outlineLvl w:val="6"/>
     </w:pPr>
     <w:rPr>
-      <w:rFonts w:ascii="Calibri" w:hAnsi="Calibri" w:eastAsia="ＭＳ ゴシック" w:cs="" w:asciiTheme="majorHAnsi" w:cstheme="majorBidi" w:eastAsiaTheme="majorEastAsia" w:hAnsiTheme="majorHAnsi"/>
+      <w:rFonts w:ascii="Calibri" w:hAnsi="Calibri" w:eastAsia="" w:cs="" w:asciiTheme="majorHAnsi" w:cstheme="majorBidi" w:eastAsiaTheme="majorEastAsia" w:hAnsiTheme="majorHAnsi"/>
       <w:i/>
       <w:iCs/>
       <w:color w:themeColor="text1" w:themeTint="bf" w:val="404040"/>
@@ -3773,7 +3854,7 @@
       <w:outlineLvl w:val="7"/>
     </w:pPr>
     <w:rPr>
-      <w:rFonts w:ascii="Calibri" w:hAnsi="Calibri" w:eastAsia="ＭＳ ゴシック" w:cs="" w:asciiTheme="majorHAnsi" w:cstheme="majorBidi" w:eastAsiaTheme="majorEastAsia" w:hAnsiTheme="majorHAnsi"/>
+      <w:rFonts w:ascii="Calibri" w:hAnsi="Calibri" w:eastAsia="" w:cs="" w:asciiTheme="majorHAnsi" w:cstheme="majorBidi" w:eastAsiaTheme="majorEastAsia" w:hAnsiTheme="majorHAnsi"/>
       <w:color w:themeColor="accent1" w:val="4F81BD"/>
       <w:sz w:val="20"/>
       <w:szCs w:val="20"/>
@@ -3796,7 +3877,7 @@
       <w:outlineLvl w:val="8"/>
     </w:pPr>
     <w:rPr>
-      <w:rFonts w:ascii="Calibri" w:hAnsi="Calibri" w:eastAsia="ＭＳ ゴシック" w:cs="" w:asciiTheme="majorHAnsi" w:cstheme="majorBidi" w:eastAsiaTheme="majorEastAsia" w:hAnsiTheme="majorHAnsi"/>
+      <w:rFonts w:ascii="Calibri" w:hAnsi="Calibri" w:eastAsia="" w:cs="" w:asciiTheme="majorHAnsi" w:cstheme="majorBidi" w:eastAsiaTheme="majorEastAsia" w:hAnsiTheme="majorHAnsi"/>
       <w:i/>
       <w:iCs/>
       <w:color w:themeColor="text1" w:themeTint="bf" w:val="404040"/>
@@ -3838,7 +3919,7 @@
     <w:qFormat/>
     <w:rsid w:val="00fc693f"/>
     <w:rPr>
-      <w:rFonts w:ascii="Calibri" w:hAnsi="Calibri" w:eastAsia="ＭＳ ゴシック" w:cs="" w:asciiTheme="majorHAnsi" w:cstheme="majorBidi" w:eastAsiaTheme="majorEastAsia" w:hAnsiTheme="majorHAnsi"/>
+      <w:rFonts w:ascii="Calibri" w:hAnsi="Calibri" w:eastAsia="" w:cs="" w:asciiTheme="majorHAnsi" w:cstheme="majorBidi" w:eastAsiaTheme="majorEastAsia" w:hAnsiTheme="majorHAnsi"/>
       <w:b/>
       <w:bCs/>
       <w:color w:themeColor="accent1" w:themeShade="bf" w:val="365F91"/>
@@ -3854,7 +3935,7 @@
     <w:qFormat/>
     <w:rsid w:val="00fc693f"/>
     <w:rPr>
-      <w:rFonts w:ascii="Calibri" w:hAnsi="Calibri" w:eastAsia="ＭＳ ゴシック" w:cs="" w:asciiTheme="majorHAnsi" w:cstheme="majorBidi" w:eastAsiaTheme="majorEastAsia" w:hAnsiTheme="majorHAnsi"/>
+      <w:rFonts w:ascii="Calibri" w:hAnsi="Calibri" w:eastAsia="" w:cs="" w:asciiTheme="majorHAnsi" w:cstheme="majorBidi" w:eastAsiaTheme="majorEastAsia" w:hAnsiTheme="majorHAnsi"/>
       <w:b/>
       <w:bCs/>
       <w:color w:themeColor="accent1" w:val="4F81BD"/>
@@ -3870,7 +3951,7 @@
     <w:qFormat/>
     <w:rsid w:val="00fc693f"/>
     <w:rPr>
-      <w:rFonts w:ascii="Calibri" w:hAnsi="Calibri" w:eastAsia="ＭＳ ゴシック" w:cs="" w:asciiTheme="majorHAnsi" w:cstheme="majorBidi" w:eastAsiaTheme="majorEastAsia" w:hAnsiTheme="majorHAnsi"/>
+      <w:rFonts w:ascii="Calibri" w:hAnsi="Calibri" w:eastAsia="" w:cs="" w:asciiTheme="majorHAnsi" w:cstheme="majorBidi" w:eastAsiaTheme="majorEastAsia" w:hAnsiTheme="majorHAnsi"/>
       <w:b/>
       <w:bCs/>
       <w:color w:themeColor="accent1" w:val="4F81BD"/>
@@ -3884,7 +3965,7 @@
     <w:qFormat/>
     <w:rsid w:val="00fc693f"/>
     <w:rPr>
-      <w:rFonts w:ascii="Calibri" w:hAnsi="Calibri" w:eastAsia="ＭＳ ゴシック" w:cs="" w:asciiTheme="majorHAnsi" w:cstheme="majorBidi" w:eastAsiaTheme="majorEastAsia" w:hAnsiTheme="majorHAnsi"/>
+      <w:rFonts w:ascii="Calibri" w:hAnsi="Calibri" w:eastAsia="" w:cs="" w:asciiTheme="majorHAnsi" w:cstheme="majorBidi" w:eastAsiaTheme="majorEastAsia" w:hAnsiTheme="majorHAnsi"/>
       <w:color w:themeColor="text2" w:themeShade="bf" w:val="17365D"/>
       <w:spacing w:val="5"/>
       <w:kern w:val="2"/>
@@ -3900,7 +3981,7 @@
     <w:qFormat/>
     <w:rsid w:val="00fc693f"/>
     <w:rPr>
-      <w:rFonts w:ascii="Calibri" w:hAnsi="Calibri" w:eastAsia="ＭＳ ゴシック" w:cs="" w:asciiTheme="majorHAnsi" w:cstheme="majorBidi" w:eastAsiaTheme="majorEastAsia" w:hAnsiTheme="majorHAnsi"/>
+      <w:rFonts w:ascii="Calibri" w:hAnsi="Calibri" w:eastAsia="" w:cs="" w:asciiTheme="majorHAnsi" w:cstheme="majorBidi" w:eastAsiaTheme="majorEastAsia" w:hAnsiTheme="majorHAnsi"/>
       <w:i/>
       <w:iCs/>
       <w:color w:themeColor="accent1" w:val="4F81BD"/>
@@ -3973,7 +4054,7 @@
     <w:qFormat/>
     <w:rsid w:val="00fc693f"/>
     <w:rPr>
-      <w:rFonts w:ascii="Calibri" w:hAnsi="Calibri" w:eastAsia="ＭＳ ゴシック" w:cs="" w:asciiTheme="majorHAnsi" w:cstheme="majorBidi" w:eastAsiaTheme="majorEastAsia" w:hAnsiTheme="majorHAnsi"/>
+      <w:rFonts w:ascii="Calibri" w:hAnsi="Calibri" w:eastAsia="" w:cs="" w:asciiTheme="majorHAnsi" w:cstheme="majorBidi" w:eastAsiaTheme="majorEastAsia" w:hAnsiTheme="majorHAnsi"/>
       <w:b/>
       <w:bCs/>
       <w:i/>
@@ -3990,7 +4071,7 @@
     <w:qFormat/>
     <w:rsid w:val="00fc693f"/>
     <w:rPr>
-      <w:rFonts w:ascii="Calibri" w:hAnsi="Calibri" w:eastAsia="ＭＳ ゴシック" w:cs="" w:asciiTheme="majorHAnsi" w:cstheme="majorBidi" w:eastAsiaTheme="majorEastAsia" w:hAnsiTheme="majorHAnsi"/>
+      <w:rFonts w:ascii="Calibri" w:hAnsi="Calibri" w:eastAsia="" w:cs="" w:asciiTheme="majorHAnsi" w:cstheme="majorBidi" w:eastAsiaTheme="majorEastAsia" w:hAnsiTheme="majorHAnsi"/>
       <w:color w:themeColor="accent1" w:themeShade="7f" w:val="243F60"/>
     </w:rPr>
   </w:style>
@@ -4003,7 +4084,7 @@
     <w:qFormat/>
     <w:rsid w:val="00fc693f"/>
     <w:rPr>
-      <w:rFonts w:ascii="Calibri" w:hAnsi="Calibri" w:eastAsia="ＭＳ ゴシック" w:cs="" w:asciiTheme="majorHAnsi" w:cstheme="majorBidi" w:eastAsiaTheme="majorEastAsia" w:hAnsiTheme="majorHAnsi"/>
+      <w:rFonts w:ascii="Calibri" w:hAnsi="Calibri" w:eastAsia="" w:cs="" w:asciiTheme="majorHAnsi" w:cstheme="majorBidi" w:eastAsiaTheme="majorEastAsia" w:hAnsiTheme="majorHAnsi"/>
       <w:i/>
       <w:iCs/>
       <w:color w:themeColor="accent1" w:themeShade="7f" w:val="243F60"/>
@@ -4018,7 +4099,7 @@
     <w:qFormat/>
     <w:rsid w:val="00fc693f"/>
     <w:rPr>
-      <w:rFonts w:ascii="Calibri" w:hAnsi="Calibri" w:eastAsia="ＭＳ ゴシック" w:cs="" w:asciiTheme="majorHAnsi" w:cstheme="majorBidi" w:eastAsiaTheme="majorEastAsia" w:hAnsiTheme="majorHAnsi"/>
+      <w:rFonts w:ascii="Calibri" w:hAnsi="Calibri" w:eastAsia="" w:cs="" w:asciiTheme="majorHAnsi" w:cstheme="majorBidi" w:eastAsiaTheme="majorEastAsia" w:hAnsiTheme="majorHAnsi"/>
       <w:i/>
       <w:iCs/>
       <w:color w:themeColor="text1" w:themeTint="bf" w:val="404040"/>
@@ -4033,7 +4114,7 @@
     <w:qFormat/>
     <w:rsid w:val="00fc693f"/>
     <w:rPr>
-      <w:rFonts w:ascii="Calibri" w:hAnsi="Calibri" w:eastAsia="ＭＳ ゴシック" w:cs="" w:asciiTheme="majorHAnsi" w:cstheme="majorBidi" w:eastAsiaTheme="majorEastAsia" w:hAnsiTheme="majorHAnsi"/>
+      <w:rFonts w:ascii="Calibri" w:hAnsi="Calibri" w:eastAsia="" w:cs="" w:asciiTheme="majorHAnsi" w:cstheme="majorBidi" w:eastAsiaTheme="majorEastAsia" w:hAnsiTheme="majorHAnsi"/>
       <w:color w:themeColor="accent1" w:val="4F81BD"/>
       <w:sz w:val="20"/>
       <w:szCs w:val="20"/>
@@ -4048,7 +4129,7 @@
     <w:qFormat/>
     <w:rsid w:val="00fc693f"/>
     <w:rPr>
-      <w:rFonts w:ascii="Calibri" w:hAnsi="Calibri" w:eastAsia="ＭＳ ゴシック" w:cs="" w:asciiTheme="majorHAnsi" w:cstheme="majorBidi" w:eastAsiaTheme="majorEastAsia" w:hAnsiTheme="majorHAnsi"/>
+      <w:rFonts w:ascii="Calibri" w:hAnsi="Calibri" w:eastAsia="" w:cs="" w:asciiTheme="majorHAnsi" w:cstheme="majorBidi" w:eastAsiaTheme="majorEastAsia" w:hAnsiTheme="majorHAnsi"/>
       <w:i/>
       <w:iCs/>
       <w:color w:themeColor="text1" w:themeTint="bf" w:val="404040"/>
@@ -4278,12 +4359,13 @@
     <w:rsid w:val="00fc693f"/>
     <w:pPr>
       <w:widowControl/>
+      <w:suppressAutoHyphens w:val="true"/>
       <w:bidi w:val="0"/>
       <w:spacing w:lineRule="auto" w:line="240" w:before="0" w:after="0"/>
       <w:jc w:val="start"/>
     </w:pPr>
     <w:rPr>
-      <w:rFonts w:ascii="Cambria" w:hAnsi="Cambria" w:eastAsia="ＭＳ 明朝" w:cs="" w:asciiTheme="minorHAnsi" w:cstheme="minorBidi" w:eastAsiaTheme="minorEastAsia" w:hAnsiTheme="minorHAnsi"/>
+      <w:rFonts w:ascii="Cambria" w:hAnsi="Cambria" w:eastAsia="" w:cs="" w:asciiTheme="minorHAnsi" w:cstheme="minorBidi" w:eastAsiaTheme="minorEastAsia" w:hAnsiTheme="minorHAnsi"/>
       <w:color w:val="auto"/>
       <w:kern w:val="0"/>
       <w:sz w:val="22"/>
@@ -4307,7 +4389,7 @@
       <w:contextualSpacing/>
     </w:pPr>
     <w:rPr>
-      <w:rFonts w:ascii="Calibri" w:hAnsi="Calibri" w:eastAsia="ＭＳ ゴシック" w:cs="" w:asciiTheme="majorHAnsi" w:cstheme="majorBidi" w:eastAsiaTheme="majorEastAsia" w:hAnsiTheme="majorHAnsi"/>
+      <w:rFonts w:ascii="Calibri" w:hAnsi="Calibri" w:eastAsia="" w:cs="" w:asciiTheme="majorHAnsi" w:cstheme="majorBidi" w:eastAsiaTheme="majorEastAsia" w:hAnsiTheme="majorHAnsi"/>
       <w:color w:themeColor="text2" w:themeShade="bf" w:val="17365D"/>
       <w:spacing w:val="5"/>
       <w:kern w:val="2"/>
@@ -4325,7 +4407,7 @@
     <w:rsid w:val="00fc693f"/>
     <w:pPr/>
     <w:rPr>
-      <w:rFonts w:ascii="Calibri" w:hAnsi="Calibri" w:eastAsia="ＭＳ ゴシック" w:cs="" w:asciiTheme="majorHAnsi" w:cstheme="majorBidi" w:eastAsiaTheme="majorEastAsia" w:hAnsiTheme="majorHAnsi"/>
+      <w:rFonts w:ascii="Calibri" w:hAnsi="Calibri" w:eastAsia="" w:cs="" w:asciiTheme="majorHAnsi" w:cstheme="majorBidi" w:eastAsiaTheme="majorEastAsia" w:hAnsiTheme="majorHAnsi"/>
       <w:i/>
       <w:iCs/>
       <w:color w:themeColor="accent1" w:val="4F81BD"/>
@@ -4558,12 +4640,13 @@
         <w:tab w:val="left" w:pos="3456" w:leader="none"/>
         <w:tab w:val="left" w:pos="4032" w:leader="none"/>
       </w:tabs>
+      <w:suppressAutoHyphens w:val="true"/>
       <w:bidi w:val="0"/>
       <w:spacing w:lineRule="auto" w:line="276" w:before="0" w:after="200"/>
       <w:jc w:val="start"/>
     </w:pPr>
     <w:rPr>
-      <w:rFonts w:ascii="Courier" w:hAnsi="Courier" w:eastAsia="ＭＳ 明朝" w:cs="" w:cstheme="minorBidi" w:eastAsiaTheme="minorEastAsia"/>
+      <w:rFonts w:ascii="Courier" w:hAnsi="Courier" w:eastAsia="" w:cs="" w:cstheme="minorBidi" w:eastAsiaTheme="minorEastAsia"/>
       <w:color w:val="auto"/>
       <w:kern w:val="0"/>
       <w:sz w:val="20"/>
@@ -7761,7 +7844,6 @@
       <w:pPr>
         <w:spacing w:before="0" w:after="0" w:line="240" w:lineRule="auto"/>
       </w:pPr>
-      <w:rPr/>
       <w:tblPr/>
       <w:tcPr>
         <w:tcBorders>
@@ -7907,7 +7989,6 @@
       <w:pPr>
         <w:spacing w:before="0" w:after="0" w:line="240" w:lineRule="auto"/>
       </w:pPr>
-      <w:rPr/>
       <w:tblPr/>
       <w:tcPr>
         <w:tcBorders>
@@ -8053,7 +8134,6 @@
       <w:pPr>
         <w:spacing w:before="0" w:after="0" w:line="240" w:lineRule="auto"/>
       </w:pPr>
-      <w:rPr/>
       <w:tblPr/>
       <w:tcPr>
         <w:tcBorders>
@@ -8199,7 +8279,6 @@
       <w:pPr>
         <w:spacing w:before="0" w:after="0" w:line="240" w:lineRule="auto"/>
       </w:pPr>
-      <w:rPr/>
       <w:tblPr/>
       <w:tcPr>
         <w:tcBorders>
@@ -8345,7 +8424,6 @@
       <w:pPr>
         <w:spacing w:before="0" w:after="0" w:line="240" w:lineRule="auto"/>
       </w:pPr>
-      <w:rPr/>
       <w:tblPr/>
       <w:tcPr>
         <w:tcBorders>
@@ -8491,7 +8569,6 @@
       <w:pPr>
         <w:spacing w:before="0" w:after="0" w:line="240" w:lineRule="auto"/>
       </w:pPr>
-      <w:rPr/>
       <w:tblPr/>
       <w:tcPr>
         <w:tcBorders>
@@ -8637,7 +8714,6 @@
       <w:pPr>
         <w:spacing w:before="0" w:after="0" w:line="240" w:lineRule="auto"/>
       </w:pPr>
-      <w:rPr/>
       <w:tblPr/>
       <w:tcPr>
         <w:tcBorders>

</xml_diff>